<commit_message>
feat(doc-convert): update reference template with Sitka Text font
- Replace Aptos font with Sitka Text for body and headings in reference template
- Update customize-reference.py script to use Sitka Text as primary font
- Regenerate reference.docx and style-preview.docx with new font settings
- Remove temporary lock file (~$yle-preview.docx) from assets
- Update SKILL.md documentation to reflect new font family
</commit_message>
<xml_diff>
--- a/skills/doc-convert/assets/reference.docx
+++ b/skills/doc-convert/assets/reference.docx
@@ -505,7 +505,7 @@
       <w:spacing w:after="120" w:line="288" w:lineRule="auto"/>
     </w:pPr>
     <w:rPr>
-      <w:rFonts w:ascii="Aptos" w:hAnsi="Aptos"/>
+      <w:rFonts w:ascii="Sitka Text" w:hAnsi="Sitka Text"/>
       <w:color w:val="2D2D2D"/>
       <w:sz w:val="21"/>
     </w:rPr>
@@ -519,7 +519,7 @@
       <w:spacing w:before="180" w:after="180"/>
     </w:pPr>
     <w:rPr>
-      <w:rFonts w:ascii="Aptos" w:hAnsi="Aptos"/>
+      <w:rFonts w:ascii="Sitka Text" w:hAnsi="Sitka Text"/>
       <w:color w:val="2D2D2D"/>
       <w:sz w:val="21"/>
     </w:rPr>
@@ -530,7 +530,7 @@
     <w:next w:val="BodyText"/>
     <w:qFormat/>
     <w:rPr>
-      <w:rFonts w:ascii="Aptos" w:hAnsi="Aptos"/>
+      <w:rFonts w:ascii="Sitka Text" w:hAnsi="Sitka Text"/>
       <w:color w:val="2D2D2D"/>
       <w:sz w:val="21"/>
     </w:rPr>
@@ -543,7 +543,7 @@
       <w:spacing w:before="36" w:after="36"/>
     </w:pPr>
     <w:rPr>
-      <w:rFonts w:ascii="Aptos" w:hAnsi="Aptos"/>
+      <w:rFonts w:ascii="Sitka Text" w:hAnsi="Sitka Text"/>
       <w:color w:val="2D2D2D"/>
       <w:sz w:val="21"/>
     </w:rPr>
@@ -562,7 +562,7 @@
       <w:jc w:val="center"/>
     </w:pPr>
     <w:rPr>
-      <w:rFonts w:asciiTheme="majorHAnsi" w:eastAsiaTheme="majorEastAsia" w:hAnsiTheme="majorHAnsi" w:cstheme="majorBidi" w:ascii="Aptos" w:hAnsi="Aptos"/>
+      <w:rFonts w:asciiTheme="majorHAnsi" w:eastAsiaTheme="majorEastAsia" w:hAnsiTheme="majorHAnsi" w:cstheme="majorBidi" w:ascii="Sitka Text" w:hAnsi="Sitka Text"/>
       <w:b/>
       <w:color w:val="1A1A1A"/>
       <w:sz w:val="52"/>
@@ -596,7 +596,7 @@
       <w:spacing w:after="320"/>
     </w:pPr>
     <w:rPr>
-      <w:rFonts w:eastAsiaTheme="majorEastAsia" w:cstheme="majorBidi" w:ascii="Aptos" w:hAnsi="Aptos"/>
+      <w:rFonts w:eastAsiaTheme="majorEastAsia" w:cstheme="majorBidi" w:ascii="Sitka Text" w:hAnsi="Sitka Text"/>
       <w:b w:val="0"/>
       <w:i w:val="0"/>
       <w:color w:val="555555"/>
@@ -705,7 +705,7 @@
       </w:pBdr>
     </w:pPr>
     <w:rPr>
-      <w:rFonts w:asciiTheme="majorHAnsi" w:eastAsiaTheme="majorEastAsia" w:hAnsiTheme="majorHAnsi" w:cstheme="majorBidi" w:ascii="Aptos" w:hAnsi="Aptos"/>
+      <w:rFonts w:asciiTheme="majorHAnsi" w:eastAsiaTheme="majorEastAsia" w:hAnsiTheme="majorHAnsi" w:cstheme="majorBidi" w:ascii="Sitka Text" w:hAnsi="Sitka Text"/>
       <w:b/>
       <w:i w:val="0"/>
       <w:color w:val="1A1A1A"/>
@@ -733,7 +733,7 @@
       </w:pBdr>
     </w:pPr>
     <w:rPr>
-      <w:rFonts w:asciiTheme="majorHAnsi" w:eastAsiaTheme="majorEastAsia" w:hAnsiTheme="majorHAnsi" w:cstheme="majorBidi" w:ascii="Aptos" w:hAnsi="Aptos"/>
+      <w:rFonts w:asciiTheme="majorHAnsi" w:eastAsiaTheme="majorEastAsia" w:hAnsiTheme="majorHAnsi" w:cstheme="majorBidi" w:ascii="Sitka Text" w:hAnsi="Sitka Text"/>
       <w:b/>
       <w:i w:val="0"/>
       <w:color w:val="1A1A1A"/>
@@ -758,7 +758,7 @@
       <w:outlineLvl w:val="2"/>
     </w:pPr>
     <w:rPr>
-      <w:rFonts w:eastAsiaTheme="majorEastAsia" w:cstheme="majorBidi" w:ascii="Aptos" w:hAnsi="Aptos"/>
+      <w:rFonts w:eastAsiaTheme="majorEastAsia" w:cstheme="majorBidi" w:ascii="Sitka Text" w:hAnsi="Sitka Text"/>
       <w:b/>
       <w:i w:val="0"/>
       <w:color w:val="1A1A1A"/>
@@ -783,7 +783,7 @@
       <w:outlineLvl w:val="3"/>
     </w:pPr>
     <w:rPr>
-      <w:rFonts w:eastAsiaTheme="majorEastAsia" w:cstheme="majorBidi" w:ascii="Aptos" w:hAnsi="Aptos"/>
+      <w:rFonts w:eastAsiaTheme="majorEastAsia" w:cstheme="majorBidi" w:ascii="Sitka Text" w:hAnsi="Sitka Text"/>
       <w:b/>
       <w:i w:val="0"/>
       <w:iCs/>
@@ -808,7 +808,7 @@
       <w:outlineLvl w:val="4"/>
     </w:pPr>
     <w:rPr>
-      <w:rFonts w:eastAsiaTheme="majorEastAsia" w:cstheme="majorBidi" w:ascii="Aptos" w:hAnsi="Aptos"/>
+      <w:rFonts w:eastAsiaTheme="majorEastAsia" w:cstheme="majorBidi" w:ascii="Sitka Text" w:hAnsi="Sitka Text"/>
       <w:b/>
       <w:i w:val="0"/>
       <w:color w:val="555555"/>
@@ -832,7 +832,7 @@
       <w:outlineLvl w:val="5"/>
     </w:pPr>
     <w:rPr>
-      <w:rFonts w:eastAsiaTheme="majorEastAsia" w:cstheme="majorBidi" w:ascii="Aptos" w:hAnsi="Aptos"/>
+      <w:rFonts w:eastAsiaTheme="majorEastAsia" w:cstheme="majorBidi" w:ascii="Sitka Text" w:hAnsi="Sitka Text"/>
       <w:b/>
       <w:i w:val="0"/>
       <w:iCs/>
@@ -1040,7 +1040,7 @@
       </w:pBdr>
     </w:pPr>
     <w:rPr>
-      <w:rFonts w:ascii="Aptos" w:hAnsi="Aptos"/>
+      <w:rFonts w:ascii="Sitka Text" w:hAnsi="Sitka Text"/>
       <w:i w:val="0"/>
       <w:color w:val="2D2D2D"/>
       <w:sz w:val="21"/>
@@ -1078,7 +1078,7 @@
     <w:unhideWhenUsed/>
     <w:qFormat/>
     <w:rPr>
-      <w:rFonts w:ascii="Aptos" w:hAnsi="Aptos"/>
+      <w:rFonts w:ascii="Sitka Text" w:hAnsi="Sitka Text"/>
       <w:sz w:val="20"/>
     </w:rPr>
     <w:tblPr>

</xml_diff>

<commit_message>
feat(doc-convert): add Obsidian preprocessing and enhance reference templates
- Add obsidian-img-preprocess.py script to convert Obsidian image embed syntax to standard Markdown
- Add fix-theme-fonts.py script to patch DOCX theme fonts for consistent styling
- Update reference.docx and style-preview.docx with refined heading styles and theme fonts
- Remove top spacing from Heading 1 and disable borders on Heading 1 and Heading 2
- Add comprehensive Obsidian syntax documentation with conversion examples and usage patterns
- Update SKILL.md with Obsidian image embed preprocessing workflow and supported syntax table
- Rebrand "Kiro Agent Skills" to "Agent Skills" throughout documentation for broader compatibility
- Update skills/README.md to reflect open standard approach and cross-tool compatibility
- Clarify skill installation and compatibility guidance in AGENTS.md and skills/README.md
</commit_message>
<xml_diff>
--- a/skills/doc-convert/assets/reference.docx
+++ b/skills/doc-convert/assets/reference.docx
@@ -698,11 +698,8 @@
     <w:pPr>
       <w:keepNext/>
       <w:keepLines/>
-      <w:spacing w:before="560" w:after="200" w:line="276" w:lineRule="auto"/>
+      <w:spacing w:before="360" w:after="200" w:line="276" w:lineRule="auto"/>
       <w:outlineLvl w:val="0"/>
-      <w:pBdr>
-        <w:bottom w:val="single" w:sz="4" w:space="6" w:color="E0E0E0"/>
-      </w:pBdr>
     </w:pPr>
     <w:rPr>
       <w:rFonts w:asciiTheme="majorHAnsi" w:eastAsiaTheme="majorEastAsia" w:hAnsiTheme="majorHAnsi" w:cstheme="majorBidi" w:ascii="Sitka Text" w:hAnsi="Sitka Text"/>
@@ -728,9 +725,6 @@
       <w:keepLines/>
       <w:spacing w:before="480" w:after="160" w:line="276" w:lineRule="auto"/>
       <w:outlineLvl w:val="1"/>
-      <w:pBdr>
-        <w:bottom w:val="single" w:sz="4" w:space="6" w:color="E0E0E0"/>
-      </w:pBdr>
     </w:pPr>
     <w:rPr>
       <w:rFonts w:asciiTheme="majorHAnsi" w:eastAsiaTheme="majorEastAsia" w:hAnsiTheme="majorHAnsi" w:cstheme="majorBidi" w:ascii="Sitka Text" w:hAnsi="Sitka Text"/>
@@ -1202,296 +1196,296 @@
 </file>
 
 <file path=word/theme/theme1.xml><?xml version="1.0" encoding="utf-8"?>
-<a:theme xmlns:a="http://schemas.openxmlformats.org/drawingml/2006/main" name="Office Theme">
-  <a:themeElements>
-    <a:clrScheme name="Office">
-      <a:dk1>
-        <a:sysClr val="windowText" lastClr="000000"/>
-      </a:dk1>
-      <a:lt1>
-        <a:sysClr val="window" lastClr="FFFFFF"/>
-      </a:lt1>
-      <a:dk2>
-        <a:srgbClr val="0E2841"/>
-      </a:dk2>
-      <a:lt2>
-        <a:srgbClr val="E8E8E8"/>
-      </a:lt2>
-      <a:accent1>
-        <a:srgbClr val="156082"/>
-      </a:accent1>
-      <a:accent2>
-        <a:srgbClr val="E97132"/>
-      </a:accent2>
-      <a:accent3>
-        <a:srgbClr val="196B24"/>
-      </a:accent3>
-      <a:accent4>
-        <a:srgbClr val="0F9ED5"/>
-      </a:accent4>
-      <a:accent5>
-        <a:srgbClr val="A02B93"/>
-      </a:accent5>
-      <a:accent6>
-        <a:srgbClr val="4EA72E"/>
-      </a:accent6>
-      <a:hlink>
-        <a:srgbClr val="467886"/>
-      </a:hlink>
-      <a:folHlink>
-        <a:srgbClr val="96607D"/>
-      </a:folHlink>
-    </a:clrScheme>
-    <a:fontScheme name="Office">
-      <a:majorFont>
-        <a:latin typeface="Aptos Display" panose="02110004020202020204"/>
-        <a:ea typeface=""/>
-        <a:cs typeface=""/>
-        <a:font script="Jpan" typeface="游ゴシック Light"/>
-        <a:font script="Hang" typeface="맑은 고딕"/>
-        <a:font script="Hans" typeface="等线 Light"/>
-        <a:font script="Hant" typeface="新細明體"/>
-        <a:font script="Arab" typeface="Times New Roman"/>
-        <a:font script="Hebr" typeface="Times New Roman"/>
-        <a:font script="Thai" typeface="Angsana New"/>
-        <a:font script="Ethi" typeface="Nyala"/>
-        <a:font script="Beng" typeface="Vrinda"/>
-        <a:font script="Gujr" typeface="Shruti"/>
-        <a:font script="Khmr" typeface="MoolBoran"/>
-        <a:font script="Knda" typeface="Tunga"/>
-        <a:font script="Guru" typeface="Raavi"/>
-        <a:font script="Cans" typeface="Euphemia"/>
-        <a:font script="Cher" typeface="Plantagenet Cherokee"/>
-        <a:font script="Yiii" typeface="Microsoft Yi Baiti"/>
-        <a:font script="Tibt" typeface="Microsoft Himalaya"/>
-        <a:font script="Thaa" typeface="MV Boli"/>
-        <a:font script="Deva" typeface="Mangal"/>
-        <a:font script="Telu" typeface="Gautami"/>
-        <a:font script="Taml" typeface="Latha"/>
-        <a:font script="Syrc" typeface="Estrangelo Edessa"/>
-        <a:font script="Orya" typeface="Kalinga"/>
-        <a:font script="Mlym" typeface="Kartika"/>
-        <a:font script="Laoo" typeface="DokChampa"/>
-        <a:font script="Sinh" typeface="Iskoola Pota"/>
-        <a:font script="Mong" typeface="Mongolian Baiti"/>
-        <a:font script="Viet" typeface="Times New Roman"/>
-        <a:font script="Uigh" typeface="Microsoft Uighur"/>
-        <a:font script="Geor" typeface="Sylfaen"/>
-        <a:font script="Armn" typeface="Arial"/>
-        <a:font script="Bugi" typeface="Leelawadee UI"/>
-        <a:font script="Bopo" typeface="Microsoft JhengHei"/>
-        <a:font script="Java" typeface="Javanese Text"/>
-        <a:font script="Lisu" typeface="Segoe UI"/>
-        <a:font script="Mymr" typeface="Myanmar Text"/>
-        <a:font script="Nkoo" typeface="Ebrima"/>
-        <a:font script="Olck" typeface="Nirmala UI"/>
-        <a:font script="Osma" typeface="Ebrima"/>
-        <a:font script="Phag" typeface="Phagspa"/>
-        <a:font script="Syrn" typeface="Estrangelo Edessa"/>
-        <a:font script="Syrj" typeface="Estrangelo Edessa"/>
-        <a:font script="Syre" typeface="Estrangelo Edessa"/>
-        <a:font script="Sora" typeface="Nirmala UI"/>
-        <a:font script="Tale" typeface="Microsoft Tai Le"/>
-        <a:font script="Talu" typeface="Microsoft New Tai Lue"/>
-        <a:font script="Tfng" typeface="Ebrima"/>
-      </a:majorFont>
-      <a:minorFont>
-        <a:latin typeface="Aptos" panose="02110004020202020204"/>
-        <a:ea typeface=""/>
-        <a:cs typeface=""/>
-        <a:font script="Jpan" typeface="游明朝"/>
-        <a:font script="Hang" typeface="맑은 고딕"/>
-        <a:font script="Hans" typeface="等线"/>
-        <a:font script="Hant" typeface="新細明體"/>
-        <a:font script="Arab" typeface="Arial"/>
-        <a:font script="Hebr" typeface="Arial"/>
-        <a:font script="Thai" typeface="Cordia New"/>
-        <a:font script="Ethi" typeface="Nyala"/>
-        <a:font script="Beng" typeface="Vrinda"/>
-        <a:font script="Gujr" typeface="Shruti"/>
-        <a:font script="Khmr" typeface="DaunPenh"/>
-        <a:font script="Knda" typeface="Tunga"/>
-        <a:font script="Guru" typeface="Raavi"/>
-        <a:font script="Cans" typeface="Euphemia"/>
-        <a:font script="Cher" typeface="Plantagenet Cherokee"/>
-        <a:font script="Yiii" typeface="Microsoft Yi Baiti"/>
-        <a:font script="Tibt" typeface="Microsoft Himalaya"/>
-        <a:font script="Thaa" typeface="MV Boli"/>
-        <a:font script="Deva" typeface="Mangal"/>
-        <a:font script="Telu" typeface="Gautami"/>
-        <a:font script="Taml" typeface="Latha"/>
-        <a:font script="Syrc" typeface="Estrangelo Edessa"/>
-        <a:font script="Orya" typeface="Kalinga"/>
-        <a:font script="Mlym" typeface="Kartika"/>
-        <a:font script="Laoo" typeface="DokChampa"/>
-        <a:font script="Sinh" typeface="Iskoola Pota"/>
-        <a:font script="Mong" typeface="Mongolian Baiti"/>
-        <a:font script="Viet" typeface="Arial"/>
-        <a:font script="Uigh" typeface="Microsoft Uighur"/>
-        <a:font script="Geor" typeface="Sylfaen"/>
-        <a:font script="Armn" typeface="Arial"/>
-        <a:font script="Bugi" typeface="Leelawadee UI"/>
-        <a:font script="Bopo" typeface="Microsoft JhengHei"/>
-        <a:font script="Java" typeface="Javanese Text"/>
-        <a:font script="Lisu" typeface="Segoe UI"/>
-        <a:font script="Mymr" typeface="Myanmar Text"/>
-        <a:font script="Nkoo" typeface="Ebrima"/>
-        <a:font script="Olck" typeface="Nirmala UI"/>
-        <a:font script="Osma" typeface="Ebrima"/>
-        <a:font script="Phag" typeface="Phagspa"/>
-        <a:font script="Syrn" typeface="Estrangelo Edessa"/>
-        <a:font script="Syrj" typeface="Estrangelo Edessa"/>
-        <a:font script="Syre" typeface="Estrangelo Edessa"/>
-        <a:font script="Sora" typeface="Nirmala UI"/>
-        <a:font script="Tale" typeface="Microsoft Tai Le"/>
-        <a:font script="Talu" typeface="Microsoft New Tai Lue"/>
-        <a:font script="Tfng" typeface="Ebrima"/>
-      </a:minorFont>
-    </a:fontScheme>
-    <a:fmtScheme name="Office">
-      <a:fillStyleLst>
-        <a:solidFill>
-          <a:schemeClr val="phClr"/>
-        </a:solidFill>
-        <a:gradFill rotWithShape="1">
-          <a:gsLst>
-            <a:gs pos="0">
-              <a:schemeClr val="phClr">
-                <a:lumMod val="110000"/>
-                <a:satMod val="105000"/>
-                <a:tint val="67000"/>
-              </a:schemeClr>
-            </a:gs>
-            <a:gs pos="50000">
-              <a:schemeClr val="phClr">
-                <a:lumMod val="105000"/>
-                <a:satMod val="103000"/>
-                <a:tint val="73000"/>
-              </a:schemeClr>
-            </a:gs>
-            <a:gs pos="100000">
-              <a:schemeClr val="phClr">
-                <a:lumMod val="105000"/>
-                <a:satMod val="109000"/>
-                <a:tint val="81000"/>
-              </a:schemeClr>
-            </a:gs>
-          </a:gsLst>
-          <a:lin ang="5400000" scaled="0"/>
-        </a:gradFill>
-        <a:gradFill rotWithShape="1">
-          <a:gsLst>
-            <a:gs pos="0">
-              <a:schemeClr val="phClr">
-                <a:satMod val="103000"/>
-                <a:lumMod val="102000"/>
-                <a:tint val="94000"/>
-              </a:schemeClr>
-            </a:gs>
-            <a:gs pos="50000">
-              <a:schemeClr val="phClr">
-                <a:satMod val="110000"/>
-                <a:lumMod val="100000"/>
-                <a:shade val="100000"/>
-              </a:schemeClr>
-            </a:gs>
-            <a:gs pos="100000">
-              <a:schemeClr val="phClr">
-                <a:lumMod val="99000"/>
-                <a:satMod val="120000"/>
-                <a:shade val="78000"/>
-              </a:schemeClr>
-            </a:gs>
-          </a:gsLst>
-          <a:lin ang="5400000" scaled="0"/>
-        </a:gradFill>
-      </a:fillStyleLst>
-      <a:lnStyleLst>
-        <a:ln w="6350" cap="flat" cmpd="sng" algn="ctr">
-          <a:solidFill>
-            <a:schemeClr val="phClr"/>
-          </a:solidFill>
-          <a:prstDash val="solid"/>
-          <a:miter lim="800000"/>
-        </a:ln>
-        <a:ln w="12700" cap="flat" cmpd="sng" algn="ctr">
-          <a:solidFill>
-            <a:schemeClr val="phClr"/>
-          </a:solidFill>
-          <a:prstDash val="solid"/>
-          <a:miter lim="800000"/>
-        </a:ln>
-        <a:ln w="19050" cap="flat" cmpd="sng" algn="ctr">
-          <a:solidFill>
-            <a:schemeClr val="phClr"/>
-          </a:solidFill>
-          <a:prstDash val="solid"/>
-          <a:miter lim="800000"/>
-        </a:ln>
-      </a:lnStyleLst>
-      <a:effectStyleLst>
-        <a:effectStyle>
-          <a:effectLst/>
-        </a:effectStyle>
-        <a:effectStyle>
-          <a:effectLst/>
-        </a:effectStyle>
-        <a:effectStyle>
-          <a:effectLst>
-            <a:outerShdw blurRad="57150" dist="19050" dir="5400000" algn="ctr" rotWithShape="0">
-              <a:srgbClr val="000000">
-                <a:alpha val="63000"/>
-              </a:srgbClr>
-            </a:outerShdw>
-          </a:effectLst>
-        </a:effectStyle>
-      </a:effectStyleLst>
-      <a:bgFillStyleLst>
-        <a:solidFill>
-          <a:schemeClr val="phClr"/>
-        </a:solidFill>
-        <a:solidFill>
-          <a:schemeClr val="phClr">
-            <a:tint val="95000"/>
-            <a:satMod val="170000"/>
-          </a:schemeClr>
-        </a:solidFill>
-        <a:gradFill rotWithShape="1">
-          <a:gsLst>
-            <a:gs pos="0">
-              <a:schemeClr val="phClr">
-                <a:tint val="93000"/>
-                <a:satMod val="150000"/>
-                <a:shade val="98000"/>
-                <a:lumMod val="102000"/>
-              </a:schemeClr>
-            </a:gs>
-            <a:gs pos="50000">
-              <a:schemeClr val="phClr">
-                <a:tint val="98000"/>
-                <a:satMod val="130000"/>
-                <a:shade val="90000"/>
-                <a:lumMod val="103000"/>
-              </a:schemeClr>
-            </a:gs>
-            <a:gs pos="100000">
-              <a:schemeClr val="phClr">
-                <a:shade val="63000"/>
-                <a:satMod val="120000"/>
-              </a:schemeClr>
-            </a:gs>
-          </a:gsLst>
-          <a:lin ang="5400000" scaled="0"/>
-        </a:gradFill>
-      </a:bgFillStyleLst>
-    </a:fmtScheme>
-  </a:themeElements>
-  <a:objectDefaults/>
-  <a:extraClrSchemeLst/>
-  <a:extLst>
-    <a:ext uri="{05A4C25C-085E-4340-85A3-A5531E510DB2}">
-      <thm15:themeFamily xmlns:thm15="http://schemas.microsoft.com/office/thememl/2012/main" name="Office Theme" id="{2E142A2C-CD16-42D6-873A-C26D2A0506FA}" vid="{1BDDFF52-6CD6-40A5-AB3C-68EB2F1E4D0A}"/>
-    </a:ext>
-  </a:extLst>
-</a:theme>
+<ns0:theme xmlns:ns0="http://schemas.openxmlformats.org/drawingml/2006/main" xmlns:ns1="http://schemas.microsoft.com/office/thememl/2012/main" name="Office Theme">
+  <ns0:themeElements>
+    <ns0:clrScheme name="Office">
+      <ns0:dk1>
+        <ns0:sysClr val="windowText" lastClr="000000"/>
+      </ns0:dk1>
+      <ns0:lt1>
+        <ns0:sysClr val="window" lastClr="FFFFFF"/>
+      </ns0:lt1>
+      <ns0:dk2>
+        <ns0:srgbClr val="0E2841"/>
+      </ns0:dk2>
+      <ns0:lt2>
+        <ns0:srgbClr val="E8E8E8"/>
+      </ns0:lt2>
+      <ns0:accent1>
+        <ns0:srgbClr val="156082"/>
+      </ns0:accent1>
+      <ns0:accent2>
+        <ns0:srgbClr val="E97132"/>
+      </ns0:accent2>
+      <ns0:accent3>
+        <ns0:srgbClr val="196B24"/>
+      </ns0:accent3>
+      <ns0:accent4>
+        <ns0:srgbClr val="0F9ED5"/>
+      </ns0:accent4>
+      <ns0:accent5>
+        <ns0:srgbClr val="A02B93"/>
+      </ns0:accent5>
+      <ns0:accent6>
+        <ns0:srgbClr val="4EA72E"/>
+      </ns0:accent6>
+      <ns0:hlink>
+        <ns0:srgbClr val="467886"/>
+      </ns0:hlink>
+      <ns0:folHlink>
+        <ns0:srgbClr val="96607D"/>
+      </ns0:folHlink>
+    </ns0:clrScheme>
+    <ns0:fontScheme name="Office">
+      <ns0:majorFont>
+        <ns0:latin typeface="Sitka Text" panose="02110004020202020204"/>
+        <ns0:ea typeface=""/>
+        <ns0:cs typeface=""/>
+        <ns0:font script="Jpan" typeface="游ゴシック Light"/>
+        <ns0:font script="Hang" typeface="맑은 고딕"/>
+        <ns0:font script="Hans" typeface="等线 Light"/>
+        <ns0:font script="Hant" typeface="新細明體"/>
+        <ns0:font script="Arab" typeface="Times New Roman"/>
+        <ns0:font script="Hebr" typeface="Times New Roman"/>
+        <ns0:font script="Thai" typeface="Angsana New"/>
+        <ns0:font script="Ethi" typeface="Nyala"/>
+        <ns0:font script="Beng" typeface="Vrinda"/>
+        <ns0:font script="Gujr" typeface="Shruti"/>
+        <ns0:font script="Khmr" typeface="MoolBoran"/>
+        <ns0:font script="Knda" typeface="Tunga"/>
+        <ns0:font script="Guru" typeface="Raavi"/>
+        <ns0:font script="Cans" typeface="Euphemia"/>
+        <ns0:font script="Cher" typeface="Plantagenet Cherokee"/>
+        <ns0:font script="Yiii" typeface="Microsoft Yi Baiti"/>
+        <ns0:font script="Tibt" typeface="Microsoft Himalaya"/>
+        <ns0:font script="Thaa" typeface="MV Boli"/>
+        <ns0:font script="Deva" typeface="Mangal"/>
+        <ns0:font script="Telu" typeface="Gautami"/>
+        <ns0:font script="Taml" typeface="Latha"/>
+        <ns0:font script="Syrc" typeface="Estrangelo Edessa"/>
+        <ns0:font script="Orya" typeface="Kalinga"/>
+        <ns0:font script="Mlym" typeface="Kartika"/>
+        <ns0:font script="Laoo" typeface="DokChampa"/>
+        <ns0:font script="Sinh" typeface="Iskoola Pota"/>
+        <ns0:font script="Mong" typeface="Mongolian Baiti"/>
+        <ns0:font script="Viet" typeface="Times New Roman"/>
+        <ns0:font script="Uigh" typeface="Microsoft Uighur"/>
+        <ns0:font script="Geor" typeface="Sylfaen"/>
+        <ns0:font script="Armn" typeface="Arial"/>
+        <ns0:font script="Bugi" typeface="Leelawadee UI"/>
+        <ns0:font script="Bopo" typeface="Microsoft JhengHei"/>
+        <ns0:font script="Java" typeface="Javanese Text"/>
+        <ns0:font script="Lisu" typeface="Segoe UI"/>
+        <ns0:font script="Mymr" typeface="Myanmar Text"/>
+        <ns0:font script="Nkoo" typeface="Ebrima"/>
+        <ns0:font script="Olck" typeface="Nirmala UI"/>
+        <ns0:font script="Osma" typeface="Ebrima"/>
+        <ns0:font script="Phag" typeface="Phagspa"/>
+        <ns0:font script="Syrn" typeface="Estrangelo Edessa"/>
+        <ns0:font script="Syrj" typeface="Estrangelo Edessa"/>
+        <ns0:font script="Syre" typeface="Estrangelo Edessa"/>
+        <ns0:font script="Sora" typeface="Nirmala UI"/>
+        <ns0:font script="Tale" typeface="Microsoft Tai Le"/>
+        <ns0:font script="Talu" typeface="Microsoft New Tai Lue"/>
+        <ns0:font script="Tfng" typeface="Ebrima"/>
+      </ns0:majorFont>
+      <ns0:minorFont>
+        <ns0:latin typeface="Sitka Text" panose="02110004020202020204"/>
+        <ns0:ea typeface=""/>
+        <ns0:cs typeface=""/>
+        <ns0:font script="Jpan" typeface="游明朝"/>
+        <ns0:font script="Hang" typeface="맑은 고딕"/>
+        <ns0:font script="Hans" typeface="等线"/>
+        <ns0:font script="Hant" typeface="新細明體"/>
+        <ns0:font script="Arab" typeface="Arial"/>
+        <ns0:font script="Hebr" typeface="Arial"/>
+        <ns0:font script="Thai" typeface="Cordia New"/>
+        <ns0:font script="Ethi" typeface="Nyala"/>
+        <ns0:font script="Beng" typeface="Vrinda"/>
+        <ns0:font script="Gujr" typeface="Shruti"/>
+        <ns0:font script="Khmr" typeface="DaunPenh"/>
+        <ns0:font script="Knda" typeface="Tunga"/>
+        <ns0:font script="Guru" typeface="Raavi"/>
+        <ns0:font script="Cans" typeface="Euphemia"/>
+        <ns0:font script="Cher" typeface="Plantagenet Cherokee"/>
+        <ns0:font script="Yiii" typeface="Microsoft Yi Baiti"/>
+        <ns0:font script="Tibt" typeface="Microsoft Himalaya"/>
+        <ns0:font script="Thaa" typeface="MV Boli"/>
+        <ns0:font script="Deva" typeface="Mangal"/>
+        <ns0:font script="Telu" typeface="Gautami"/>
+        <ns0:font script="Taml" typeface="Latha"/>
+        <ns0:font script="Syrc" typeface="Estrangelo Edessa"/>
+        <ns0:font script="Orya" typeface="Kalinga"/>
+        <ns0:font script="Mlym" typeface="Kartika"/>
+        <ns0:font script="Laoo" typeface="DokChampa"/>
+        <ns0:font script="Sinh" typeface="Iskoola Pota"/>
+        <ns0:font script="Mong" typeface="Mongolian Baiti"/>
+        <ns0:font script="Viet" typeface="Arial"/>
+        <ns0:font script="Uigh" typeface="Microsoft Uighur"/>
+        <ns0:font script="Geor" typeface="Sylfaen"/>
+        <ns0:font script="Armn" typeface="Arial"/>
+        <ns0:font script="Bugi" typeface="Leelawadee UI"/>
+        <ns0:font script="Bopo" typeface="Microsoft JhengHei"/>
+        <ns0:font script="Java" typeface="Javanese Text"/>
+        <ns0:font script="Lisu" typeface="Segoe UI"/>
+        <ns0:font script="Mymr" typeface="Myanmar Text"/>
+        <ns0:font script="Nkoo" typeface="Ebrima"/>
+        <ns0:font script="Olck" typeface="Nirmala UI"/>
+        <ns0:font script="Osma" typeface="Ebrima"/>
+        <ns0:font script="Phag" typeface="Phagspa"/>
+        <ns0:font script="Syrn" typeface="Estrangelo Edessa"/>
+        <ns0:font script="Syrj" typeface="Estrangelo Edessa"/>
+        <ns0:font script="Syre" typeface="Estrangelo Edessa"/>
+        <ns0:font script="Sora" typeface="Nirmala UI"/>
+        <ns0:font script="Tale" typeface="Microsoft Tai Le"/>
+        <ns0:font script="Talu" typeface="Microsoft New Tai Lue"/>
+        <ns0:font script="Tfng" typeface="Ebrima"/>
+      </ns0:minorFont>
+    </ns0:fontScheme>
+    <ns0:fmtScheme name="Office">
+      <ns0:fillStyleLst>
+        <ns0:solidFill>
+          <ns0:schemeClr val="phClr"/>
+        </ns0:solidFill>
+        <ns0:gradFill rotWithShape="1">
+          <ns0:gsLst>
+            <ns0:gs pos="0">
+              <ns0:schemeClr val="phClr">
+                <ns0:lumMod val="110000"/>
+                <ns0:satMod val="105000"/>
+                <ns0:tint val="67000"/>
+              </ns0:schemeClr>
+            </ns0:gs>
+            <ns0:gs pos="50000">
+              <ns0:schemeClr val="phClr">
+                <ns0:lumMod val="105000"/>
+                <ns0:satMod val="103000"/>
+                <ns0:tint val="73000"/>
+              </ns0:schemeClr>
+            </ns0:gs>
+            <ns0:gs pos="100000">
+              <ns0:schemeClr val="phClr">
+                <ns0:lumMod val="105000"/>
+                <ns0:satMod val="109000"/>
+                <ns0:tint val="81000"/>
+              </ns0:schemeClr>
+            </ns0:gs>
+          </ns0:gsLst>
+          <ns0:lin ang="5400000" scaled="0"/>
+        </ns0:gradFill>
+        <ns0:gradFill rotWithShape="1">
+          <ns0:gsLst>
+            <ns0:gs pos="0">
+              <ns0:schemeClr val="phClr">
+                <ns0:satMod val="103000"/>
+                <ns0:lumMod val="102000"/>
+                <ns0:tint val="94000"/>
+              </ns0:schemeClr>
+            </ns0:gs>
+            <ns0:gs pos="50000">
+              <ns0:schemeClr val="phClr">
+                <ns0:satMod val="110000"/>
+                <ns0:lumMod val="100000"/>
+                <ns0:shade val="100000"/>
+              </ns0:schemeClr>
+            </ns0:gs>
+            <ns0:gs pos="100000">
+              <ns0:schemeClr val="phClr">
+                <ns0:lumMod val="99000"/>
+                <ns0:satMod val="120000"/>
+                <ns0:shade val="78000"/>
+              </ns0:schemeClr>
+            </ns0:gs>
+          </ns0:gsLst>
+          <ns0:lin ang="5400000" scaled="0"/>
+        </ns0:gradFill>
+      </ns0:fillStyleLst>
+      <ns0:lnStyleLst>
+        <ns0:ln w="6350" cap="flat" cmpd="sng" algn="ctr">
+          <ns0:solidFill>
+            <ns0:schemeClr val="phClr"/>
+          </ns0:solidFill>
+          <ns0:prstDash val="solid"/>
+          <ns0:miter lim="800000"/>
+        </ns0:ln>
+        <ns0:ln w="12700" cap="flat" cmpd="sng" algn="ctr">
+          <ns0:solidFill>
+            <ns0:schemeClr val="phClr"/>
+          </ns0:solidFill>
+          <ns0:prstDash val="solid"/>
+          <ns0:miter lim="800000"/>
+        </ns0:ln>
+        <ns0:ln w="19050" cap="flat" cmpd="sng" algn="ctr">
+          <ns0:solidFill>
+            <ns0:schemeClr val="phClr"/>
+          </ns0:solidFill>
+          <ns0:prstDash val="solid"/>
+          <ns0:miter lim="800000"/>
+        </ns0:ln>
+      </ns0:lnStyleLst>
+      <ns0:effectStyleLst>
+        <ns0:effectStyle>
+          <ns0:effectLst/>
+        </ns0:effectStyle>
+        <ns0:effectStyle>
+          <ns0:effectLst/>
+        </ns0:effectStyle>
+        <ns0:effectStyle>
+          <ns0:effectLst>
+            <ns0:outerShdw blurRad="57150" dist="19050" dir="5400000" algn="ctr" rotWithShape="0">
+              <ns0:srgbClr val="000000">
+                <ns0:alpha val="63000"/>
+              </ns0:srgbClr>
+            </ns0:outerShdw>
+          </ns0:effectLst>
+        </ns0:effectStyle>
+      </ns0:effectStyleLst>
+      <ns0:bgFillStyleLst>
+        <ns0:solidFill>
+          <ns0:schemeClr val="phClr"/>
+        </ns0:solidFill>
+        <ns0:solidFill>
+          <ns0:schemeClr val="phClr">
+            <ns0:tint val="95000"/>
+            <ns0:satMod val="170000"/>
+          </ns0:schemeClr>
+        </ns0:solidFill>
+        <ns0:gradFill rotWithShape="1">
+          <ns0:gsLst>
+            <ns0:gs pos="0">
+              <ns0:schemeClr val="phClr">
+                <ns0:tint val="93000"/>
+                <ns0:satMod val="150000"/>
+                <ns0:shade val="98000"/>
+                <ns0:lumMod val="102000"/>
+              </ns0:schemeClr>
+            </ns0:gs>
+            <ns0:gs pos="50000">
+              <ns0:schemeClr val="phClr">
+                <ns0:tint val="98000"/>
+                <ns0:satMod val="130000"/>
+                <ns0:shade val="90000"/>
+                <ns0:lumMod val="103000"/>
+              </ns0:schemeClr>
+            </ns0:gs>
+            <ns0:gs pos="100000">
+              <ns0:schemeClr val="phClr">
+                <ns0:shade val="63000"/>
+                <ns0:satMod val="120000"/>
+              </ns0:schemeClr>
+            </ns0:gs>
+          </ns0:gsLst>
+          <ns0:lin ang="5400000" scaled="0"/>
+        </ns0:gradFill>
+      </ns0:bgFillStyleLst>
+    </ns0:fmtScheme>
+  </ns0:themeElements>
+  <ns0:objectDefaults/>
+  <ns0:extraClrSchemeLst/>
+  <ns0:extLst>
+    <ns0:ext uri="{05A4C25C-085E-4340-85A3-A5531E510DB2}">
+      <ns1:themeFamily name="Office Theme" id="{2E142A2C-CD16-42D6-873A-C26D2A0506FA}" vid="{1BDDFF52-6CD6-40A5-AB3C-68EB2F1E4D0A}"/>
+    </ns0:ext>
+  </ns0:extLst>
+</ns0:theme>
 </file>
</xml_diff>